<commit_message>
Add Gemini Enterprise partner certifications (Deployment, Agent Development)
Co-Authored-By: Claude Fable 5 <noreply@anthropic.com>
</commit_message>
<xml_diff>
--- a/resume_2page.docx
+++ b/resume_2page.docx
@@ -296,6 +296,20 @@
       </w:r>
       <w:r>
         <w:t xml:space="preserve"> including Professional Machine Learning Engineer, Generative AI Leader, and Cloud Architect.</w:t>
+      </w:r>
+    </w:p>
+    <w:p>
+      <w:pPr>
+        <w:pStyle w:val="ListBullet"/>
+      </w:pPr>
+      <w:r>
+        <w:rPr>
+          <w:b/>
+        </w:rPr>
+        <w:t>Google Cloud Partner Certifications (2026):</w:t>
+      </w:r>
+      <w:r>
+        <w:t xml:space="preserve"> Gemini Enterprise Deployment; Gemini Enterprise Agent Development.</w:t>
       </w:r>
     </w:p>
     <w:p>

</xml_diff>

<commit_message>
Add Google Cloud Ambassador to both resumes
Officially selected for the Google Cloud Ambassadors program (North
America). Added to the summary credential list and as the lead bullet in
Certifications & Developer Programs; headlines unchanged. Regenerated
docx/pdf/txt for both variants.

Co-Authored-By: Claude Opus 5 (1M context) <noreply@anthropic.com>
</commit_message>
<xml_diff>
--- a/resume_2page.docx
+++ b/resume_2page.docx
@@ -111,7 +111,7 @@
         <w:rPr>
           <w:b/>
         </w:rPr>
-        <w:t>Google Developer Expert (GDE) for AI and Cloud, AWS Community Builder (AI Engineer category), and Google TPU Builders participant</w:t>
+        <w:t>Google Cloud Ambassador, Google Developer Expert (GDE) for AI and Cloud, AWS Community Builder (AI Engineer category), and Google TPU Builders participant</w:t>
       </w:r>
       <w:r>
         <w:t xml:space="preserve">; 9x Google Cloud certified. Published the </w:t>
@@ -229,6 +229,32 @@
         <w:rPr>
           <w:b/>
         </w:rPr>
+        <w:t>Google Cloud Ambassador (2026):</w:t>
+      </w:r>
+      <w:r>
+        <w:t xml:space="preserve"> Selected for the </w:t>
+      </w:r>
+      <w:hyperlink r:id="rId14">
+        <w:r>
+          <w:rPr>
+            <w:color w:val="0563C1"/>
+            <w:u w:val="single"/>
+          </w:rPr>
+          <w:t xml:space="preserve">Google Cloud Ambassadors</w:t>
+        </w:r>
+      </w:hyperlink>
+      <w:r>
+        <w:t xml:space="preserve"> program (North America).</w:t>
+      </w:r>
+    </w:p>
+    <w:p>
+      <w:pPr>
+        <w:pStyle w:val="ListBullet"/>
+      </w:pPr>
+      <w:r>
+        <w:rPr>
+          <w:b/>
+        </w:rPr>
         <w:t>Google Developer Expert (GDE):</w:t>
       </w:r>
       <w:r>
@@ -262,7 +288,7 @@
       <w:r>
         <w:t xml:space="preserve"> AI Engineer category; five-time Community Builder Spotlight honoree (</w:t>
       </w:r>
-      <w:hyperlink r:id="rId14">
+      <w:hyperlink r:id="rId15">
         <w:r>
           <w:rPr>
             <w:color w:val="0563C1"/>
@@ -823,7 +849,7 @@
         </w:rPr>
         <w:t xml:space="preserve"> and </w:t>
       </w:r>
-      <w:hyperlink r:id="rId15">
+      <w:hyperlink r:id="rId16">
         <w:r>
           <w:rPr>
             <w:color w:val="0563C1"/>

</xml_diff>

<commit_message>
Add GDG Queens DevFest AI on Edge Gemma 4 talk (Oct 2026)
Co-Authored-By: Claude Opus 5.5 <noreply@anthropic.com>
</commit_message>
<xml_diff>
--- a/resume_2page.docx
+++ b/resume_2page.docx
@@ -743,7 +743,7 @@
         <w:t>Keynotes:</w:t>
       </w:r>
       <w:r>
-        <w:t xml:space="preserve"> Hack Michigan (May 2026) and Build with AI - Way Back Home (Mar 2026) — multimodal, real-time AI agent development.</w:t>
+        <w:t xml:space="preserve"> Hack Michigan (May 2026) and Build with AI - Way Back Home (Mar 2026) on multimodal AI agents.</w:t>
       </w:r>
     </w:p>
     <w:p>
@@ -757,7 +757,7 @@
         <w:t>Talks &amp; Demos:</w:t>
       </w:r>
       <w:r>
-        <w:t xml:space="preserve"> LLM Day NYC (Gemma 4, Jun 2026); UofT Build with AI (Multimodal ADK, Mar 2026); Agent Glow Hackathon (Gemini Live, Mar 2026); Detroit Black History Month Innovation Summit (LLM Deployment, Feb 2026).</w:t>
+        <w:t xml:space="preserve"> GDG Queens DevFest (Gemma 4 Tips and Tricks, Oct 2026); LLM Day NYC (Gemma 4, Jun 2026); UofT Build with AI (Multimodal ADK, Mar 2026); Agent Glow Hackathon (Gemini Live, Mar 2026); Detroit Black History Month Innovation Summit (LLM Deployment, Feb 2026).</w:t>
       </w:r>
     </w:p>
     <w:p>

</xml_diff>